<commit_message>
Added a changes in terminated credit note
</commit_message>
<xml_diff>
--- a/SalesInvoiceTemplate.docx
+++ b/SalesInvoiceTemplate.docx
@@ -36,11 +36,11 @@
             </w:tblPr>
             <w:tblGrid>
               <w:gridCol w:w="932"/>
-              <w:gridCol w:w="3792"/>
-              <w:gridCol w:w="193"/>
-              <w:gridCol w:w="778"/>
-              <w:gridCol w:w="810"/>
-              <w:gridCol w:w="2305"/>
+              <w:gridCol w:w="3807"/>
+              <w:gridCol w:w="76"/>
+              <w:gridCol w:w="895"/>
+              <w:gridCol w:w="809"/>
+              <w:gridCol w:w="2291"/>
               <w:gridCol w:w="2305"/>
             </w:tblGrid>
             <w:tr>
@@ -49,7 +49,7 @@
               </w:trPr>
               <w:tc>
                 <w:tcPr>
-                  <w:tcW w:w="4940" w:type="dxa"/>
+                  <w:tcW w:w="4815" w:type="dxa"/>
                   <w:gridSpan w:val="3"/>
                   <w:tcBorders>
                     <w:bottom w:val="nil"/>
@@ -92,7 +92,7 @@
               </w:tc>
               <w:tc>
                 <w:tcPr>
-                  <w:tcW w:w="5855" w:type="dxa"/>
+                  <w:tcW w:w="6300" w:type="dxa"/>
                   <w:gridSpan w:val="4"/>
                   <w:tcBorders>
                     <w:left w:val="nil"/>
@@ -136,7 +136,7 @@
                 <w:sdtContent>
                   <w:tc>
                     <w:tcPr>
-                      <w:tcW w:w="4940" w:type="dxa"/>
+                      <w:tcW w:w="4815" w:type="dxa"/>
                       <w:gridSpan w:val="3"/>
                       <w:tcBorders>
                         <w:top w:val="nil"/>
@@ -165,7 +165,7 @@
                 <w:sdtContent>
                   <w:tc>
                     <w:tcPr>
-                      <w:tcW w:w="5855" w:type="dxa"/>
+                      <w:tcW w:w="6300" w:type="dxa"/>
                       <w:gridSpan w:val="4"/>
                       <w:vMerge w:val="restart"/>
                       <w:tcBorders>
@@ -184,9 +184,9 @@
                           <w:noProof/>
                         </w:rPr>
                         <w:drawing>
-                          <wp:inline distT="0" distB="0" distL="0" distR="0" wp14:anchorId="5807A505" wp14:editId="0BB9D0E3">
-                            <wp:extent cx="3451860" cy="1644650"/>
-                            <wp:effectExtent l="0" t="0" r="0" b="0"/>
+                          <wp:inline distT="0" distB="0" distL="0" distR="0" wp14:anchorId="5807A505" wp14:editId="5950B520">
+                            <wp:extent cx="1859280" cy="1043940"/>
+                            <wp:effectExtent l="0" t="0" r="7620" b="3810"/>
                             <wp:docPr id="2" name="Picture 1"/>
                             <wp:cNvGraphicFramePr>
                               <a:graphicFrameLocks xmlns:a="http://schemas.openxmlformats.org/drawingml/2006/main" noChangeAspect="1"/>
@@ -209,7 +209,7 @@
                                   <pic:spPr bwMode="auto">
                                     <a:xfrm>
                                       <a:off x="0" y="0"/>
-                                      <a:ext cx="3452857" cy="1645125"/>
+                                      <a:ext cx="1859820" cy="1044243"/>
                                     </a:xfrm>
                                     <a:prstGeom prst="rect">
                                       <a:avLst/>
@@ -233,7 +233,7 @@
             <w:tr>
               <w:tc>
                 <w:tcPr>
-                  <w:tcW w:w="4940" w:type="dxa"/>
+                  <w:tcW w:w="4815" w:type="dxa"/>
                   <w:gridSpan w:val="3"/>
                   <w:tcBorders>
                     <w:top w:val="nil"/>
@@ -305,7 +305,7 @@
               </w:tc>
               <w:tc>
                 <w:tcPr>
-                  <w:tcW w:w="5855" w:type="dxa"/>
+                  <w:tcW w:w="6300" w:type="dxa"/>
                   <w:gridSpan w:val="4"/>
                   <w:vMerge/>
                   <w:tcBorders>
@@ -321,7 +321,7 @@
             <w:tr>
               <w:tc>
                 <w:tcPr>
-                  <w:tcW w:w="4940" w:type="dxa"/>
+                  <w:tcW w:w="4815" w:type="dxa"/>
                   <w:gridSpan w:val="3"/>
                   <w:tcBorders>
                     <w:top w:val="nil"/>
@@ -356,7 +356,7 @@
               </w:tc>
               <w:tc>
                 <w:tcPr>
-                  <w:tcW w:w="5855" w:type="dxa"/>
+                  <w:tcW w:w="6300" w:type="dxa"/>
                   <w:gridSpan w:val="4"/>
                   <w:vMerge/>
                   <w:tcBorders>
@@ -372,7 +372,7 @@
             <w:tr>
               <w:tc>
                 <w:tcPr>
-                  <w:tcW w:w="4940" w:type="dxa"/>
+                  <w:tcW w:w="4815" w:type="dxa"/>
                   <w:gridSpan w:val="3"/>
                   <w:tcBorders>
                     <w:top w:val="nil"/>
@@ -407,7 +407,7 @@
               </w:tc>
               <w:tc>
                 <w:tcPr>
-                  <w:tcW w:w="5855" w:type="dxa"/>
+                  <w:tcW w:w="6300" w:type="dxa"/>
                   <w:gridSpan w:val="4"/>
                   <w:vMerge/>
                   <w:tcBorders>
@@ -423,7 +423,7 @@
             <w:tr>
               <w:tc>
                 <w:tcPr>
-                  <w:tcW w:w="4940" w:type="dxa"/>
+                  <w:tcW w:w="4815" w:type="dxa"/>
                   <w:gridSpan w:val="3"/>
                   <w:tcBorders>
                     <w:top w:val="nil"/>
@@ -435,11 +435,33 @@
                   <w:r>
                     <w:t>TRN:</w:t>
                   </w:r>
-                </w:p>
-              </w:tc>
-              <w:tc>
-                <w:tcPr>
-                  <w:tcW w:w="5855" w:type="dxa"/>
+                  <w:r>
+                    <w:t xml:space="preserve"> </w:t>
+                  </w:r>
+                  <w:sdt>
+                    <w:sdtPr>
+                      <w:id w:val="-131709380"/>
+                      <w:placeholder>
+                        <w:docPart w:val="DefaultPlaceholder_-1854013440"/>
+                      </w:placeholder>
+                      <w:dataBinding w:prefixMappings="xmlns:ns0='urn:microsoft-dynamics-nav/reports/InvoiceTemplate/50104/'" w:xpath="/ns0:NavWordReportXmlPart[1]/ns0:SalesHeader[1]/ns0:CompanyTRN[1]" w:storeItemID="{8BA33C80-C320-484C-9EE6-B028EA57E99B}"/>
+                      <w:text/>
+                      <w:alias w:val="#Nav: /SalesHeader/CompanyTRN"/>
+                      <w:tag w:val="#Nav: InvoiceTemplate/50104"/>
+                    </w:sdtPr>
+                    <w:sdtContent>
+                      <w:proofErr w:type="spellStart"/>
+                      <w:r>
+                        <w:t>CompanyTRN</w:t>
+                      </w:r>
+                      <w:proofErr w:type="spellEnd"/>
+                    </w:sdtContent>
+                  </w:sdt>
+                </w:p>
+              </w:tc>
+              <w:tc>
+                <w:tcPr>
+                  <w:tcW w:w="6300" w:type="dxa"/>
                   <w:gridSpan w:val="4"/>
                   <w:vMerge/>
                   <w:tcBorders>
@@ -455,7 +477,7 @@
             <w:tr>
               <w:tc>
                 <w:tcPr>
-                  <w:tcW w:w="10795" w:type="dxa"/>
+                  <w:tcW w:w="11115" w:type="dxa"/>
                   <w:gridSpan w:val="7"/>
                   <w:tcBorders>
                     <w:top w:val="nil"/>
@@ -467,7 +489,7 @@
             <w:tr>
               <w:tc>
                 <w:tcPr>
-                  <w:tcW w:w="4940" w:type="dxa"/>
+                  <w:tcW w:w="4815" w:type="dxa"/>
                   <w:gridSpan w:val="3"/>
                   <w:tcBorders>
                     <w:bottom w:val="nil"/>
@@ -498,7 +520,7 @@
               </w:tc>
               <w:tc>
                 <w:tcPr>
-                  <w:tcW w:w="5855" w:type="dxa"/>
+                  <w:tcW w:w="6300" w:type="dxa"/>
                   <w:gridSpan w:val="4"/>
                   <w:tcBorders>
                     <w:bottom w:val="nil"/>
@@ -533,7 +555,7 @@
             <w:tr>
               <w:tc>
                 <w:tcPr>
-                  <w:tcW w:w="4940" w:type="dxa"/>
+                  <w:tcW w:w="4815" w:type="dxa"/>
                   <w:gridSpan w:val="3"/>
                   <w:tcBorders>
                     <w:top w:val="nil"/>
@@ -567,7 +589,7 @@
               </w:tc>
               <w:tc>
                 <w:tcPr>
-                  <w:tcW w:w="5855" w:type="dxa"/>
+                  <w:tcW w:w="6300" w:type="dxa"/>
                   <w:gridSpan w:val="4"/>
                   <w:tcBorders>
                     <w:top w:val="nil"/>
@@ -603,7 +625,7 @@
             <w:tr>
               <w:tc>
                 <w:tcPr>
-                  <w:tcW w:w="10795" w:type="dxa"/>
+                  <w:tcW w:w="11115" w:type="dxa"/>
                   <w:gridSpan w:val="7"/>
                   <w:tcBorders>
                     <w:left w:val="nil"/>
@@ -616,7 +638,7 @@
             <w:tr>
               <w:tc>
                 <w:tcPr>
-                  <w:tcW w:w="10795" w:type="dxa"/>
+                  <w:tcW w:w="11115" w:type="dxa"/>
                   <w:gridSpan w:val="7"/>
                   <w:shd w:val="clear" w:color="auto" w:fill="00B0F0"/>
                 </w:tcPr>
@@ -659,7 +681,7 @@
                 <w:sdtContent>
                   <w:tc>
                     <w:tcPr>
-                      <w:tcW w:w="4940" w:type="dxa"/>
+                      <w:tcW w:w="4815" w:type="dxa"/>
                       <w:gridSpan w:val="3"/>
                       <w:tcBorders>
                         <w:bottom w:val="nil"/>
@@ -681,7 +703,7 @@
               </w:sdt>
               <w:tc>
                 <w:tcPr>
-                  <w:tcW w:w="5855" w:type="dxa"/>
+                  <w:tcW w:w="6300" w:type="dxa"/>
                   <w:gridSpan w:val="4"/>
                   <w:tcBorders>
                     <w:bottom w:val="nil"/>
@@ -731,7 +753,7 @@
                 <w:sdtContent>
                   <w:tc>
                     <w:tcPr>
-                      <w:tcW w:w="4940" w:type="dxa"/>
+                      <w:tcW w:w="4815" w:type="dxa"/>
                       <w:gridSpan w:val="3"/>
                       <w:tcBorders>
                         <w:top w:val="nil"/>
@@ -750,7 +772,7 @@
               </w:sdt>
               <w:tc>
                 <w:tcPr>
-                  <w:tcW w:w="5855" w:type="dxa"/>
+                  <w:tcW w:w="6300" w:type="dxa"/>
                   <w:gridSpan w:val="4"/>
                   <w:tcBorders>
                     <w:top w:val="nil"/>
@@ -789,7 +811,7 @@
               </w:trPr>
               <w:tc>
                 <w:tcPr>
-                  <w:tcW w:w="4940" w:type="dxa"/>
+                  <w:tcW w:w="4815" w:type="dxa"/>
                   <w:gridSpan w:val="3"/>
                   <w:tcBorders>
                     <w:top w:val="nil"/>
@@ -826,7 +848,7 @@
               </w:tc>
               <w:tc>
                 <w:tcPr>
-                  <w:tcW w:w="5855" w:type="dxa"/>
+                  <w:tcW w:w="6300" w:type="dxa"/>
                   <w:gridSpan w:val="4"/>
                   <w:tcBorders>
                     <w:top w:val="nil"/>
@@ -865,7 +887,7 @@
               </w:trPr>
               <w:tc>
                 <w:tcPr>
-                  <w:tcW w:w="4940" w:type="dxa"/>
+                  <w:tcW w:w="4815" w:type="dxa"/>
                   <w:gridSpan w:val="3"/>
                   <w:tcBorders>
                     <w:top w:val="nil"/>
@@ -899,7 +921,7 @@
               </w:tc>
               <w:tc>
                 <w:tcPr>
-                  <w:tcW w:w="5855" w:type="dxa"/>
+                  <w:tcW w:w="6300" w:type="dxa"/>
                   <w:gridSpan w:val="4"/>
                   <w:tcBorders>
                     <w:top w:val="nil"/>
@@ -938,7 +960,7 @@
               </w:trPr>
               <w:tc>
                 <w:tcPr>
-                  <w:tcW w:w="4940" w:type="dxa"/>
+                  <w:tcW w:w="4815" w:type="dxa"/>
                   <w:gridSpan w:val="3"/>
                   <w:tcBorders>
                     <w:top w:val="nil"/>
@@ -974,7 +996,7 @@
               </w:tc>
               <w:tc>
                 <w:tcPr>
-                  <w:tcW w:w="5855" w:type="dxa"/>
+                  <w:tcW w:w="6300" w:type="dxa"/>
                   <w:gridSpan w:val="4"/>
                   <w:tcBorders>
                     <w:top w:val="nil"/>
@@ -1012,7 +1034,7 @@
               </w:trPr>
               <w:tc>
                 <w:tcPr>
-                  <w:tcW w:w="10795" w:type="dxa"/>
+                  <w:tcW w:w="11115" w:type="dxa"/>
                   <w:gridSpan w:val="7"/>
                 </w:tcPr>
                 <w:p/>
@@ -1045,7 +1067,7 @@
               </w:tc>
               <w:tc>
                 <w:tcPr>
-                  <w:tcW w:w="3815" w:type="dxa"/>
+                  <w:tcW w:w="3807" w:type="dxa"/>
                   <w:shd w:val="clear" w:color="auto" w:fill="00B0F0"/>
                 </w:tcPr>
                 <w:p>
@@ -1066,7 +1088,7 @@
               </w:tc>
               <w:tc>
                 <w:tcPr>
-                  <w:tcW w:w="972" w:type="dxa"/>
+                  <w:tcW w:w="971" w:type="dxa"/>
                   <w:gridSpan w:val="2"/>
                   <w:shd w:val="clear" w:color="auto" w:fill="00B0F0"/>
                 </w:tcPr>
@@ -1088,7 +1110,7 @@
               </w:tc>
               <w:tc>
                 <w:tcPr>
-                  <w:tcW w:w="810" w:type="dxa"/>
+                  <w:tcW w:w="809" w:type="dxa"/>
                   <w:shd w:val="clear" w:color="auto" w:fill="00B0F0"/>
                 </w:tcPr>
                 <w:p>
@@ -1109,7 +1131,7 @@
               </w:tc>
               <w:tc>
                 <w:tcPr>
-                  <w:tcW w:w="2305" w:type="dxa"/>
+                  <w:tcW w:w="2291" w:type="dxa"/>
                   <w:shd w:val="clear" w:color="auto" w:fill="00B0F0"/>
                 </w:tcPr>
                 <w:p>
@@ -1130,7 +1152,7 @@
               </w:tc>
               <w:tc>
                 <w:tcPr>
-                  <w:tcW w:w="1961" w:type="dxa"/>
+                  <w:tcW w:w="2305" w:type="dxa"/>
                   <w:shd w:val="clear" w:color="auto" w:fill="00B0F0"/>
                 </w:tcPr>
                 <w:p>
@@ -1192,7 +1214,7 @@
                         <w:sdtContent>
                           <w:tc>
                             <w:tcPr>
-                              <w:tcW w:w="3815" w:type="dxa"/>
+                              <w:tcW w:w="3807" w:type="dxa"/>
                             </w:tcPr>
                             <w:p>
                               <w:r>
@@ -1216,7 +1238,7 @@
                         <w:sdtContent>
                           <w:tc>
                             <w:tcPr>
-                              <w:tcW w:w="972" w:type="dxa"/>
+                              <w:tcW w:w="971" w:type="dxa"/>
                               <w:gridSpan w:val="2"/>
                             </w:tcPr>
                             <w:p>
@@ -1241,7 +1263,7 @@
                         <w:sdtContent>
                           <w:tc>
                             <w:tcPr>
-                              <w:tcW w:w="810" w:type="dxa"/>
+                              <w:tcW w:w="809" w:type="dxa"/>
                             </w:tcPr>
                             <w:p>
                               <w:r>
@@ -1265,7 +1287,7 @@
                         <w:sdtContent>
                           <w:tc>
                             <w:tcPr>
-                              <w:tcW w:w="2305" w:type="dxa"/>
+                              <w:tcW w:w="2291" w:type="dxa"/>
                             </w:tcPr>
                             <w:p>
                               <w:proofErr w:type="spellStart"/>
@@ -1291,7 +1313,7 @@
                         <w:sdtContent>
                           <w:tc>
                             <w:tcPr>
-                              <w:tcW w:w="1961" w:type="dxa"/>
+                              <w:tcW w:w="2305" w:type="dxa"/>
                             </w:tcPr>
                             <w:p>
                               <w:proofErr w:type="spellStart"/>
@@ -1320,7 +1342,7 @@
               </w:tc>
               <w:tc>
                 <w:tcPr>
-                  <w:tcW w:w="3815" w:type="dxa"/>
+                  <w:tcW w:w="3807" w:type="dxa"/>
                 </w:tcPr>
                 <w:p>
                   <w:pPr>
@@ -1340,7 +1362,7 @@
               </w:tc>
               <w:tc>
                 <w:tcPr>
-                  <w:tcW w:w="972" w:type="dxa"/>
+                  <w:tcW w:w="971" w:type="dxa"/>
                   <w:gridSpan w:val="2"/>
                 </w:tcPr>
                 <w:p>
@@ -1354,7 +1376,7 @@
               </w:tc>
               <w:tc>
                 <w:tcPr>
-                  <w:tcW w:w="810" w:type="dxa"/>
+                  <w:tcW w:w="809" w:type="dxa"/>
                 </w:tcPr>
                 <w:p>
                   <w:pPr>
@@ -1367,7 +1389,7 @@
               </w:tc>
               <w:tc>
                 <w:tcPr>
-                  <w:tcW w:w="2305" w:type="dxa"/>
+                  <w:tcW w:w="2291" w:type="dxa"/>
                 </w:tcPr>
                 <w:p>
                   <w:pPr>
@@ -1392,7 +1414,7 @@
                 <w:sdtContent>
                   <w:tc>
                     <w:tcPr>
-                      <w:tcW w:w="1961" w:type="dxa"/>
+                      <w:tcW w:w="2305" w:type="dxa"/>
                     </w:tcPr>
                     <w:p>
                       <w:pPr>
@@ -1414,7 +1436,7 @@
               </w:trPr>
               <w:tc>
                 <w:tcPr>
-                  <w:tcW w:w="10795" w:type="dxa"/>
+                  <w:tcW w:w="11115" w:type="dxa"/>
                   <w:gridSpan w:val="7"/>
                   <w:tcBorders>
                     <w:bottom w:val="single" w:color="auto" w:sz="4" w:space="0"/>
@@ -1436,7 +1458,7 @@
               </w:trPr>
               <w:tc>
                 <w:tcPr>
-                  <w:tcW w:w="10795" w:type="dxa"/>
+                  <w:tcW w:w="11115" w:type="dxa"/>
                   <w:gridSpan w:val="7"/>
                   <w:tcBorders>
                     <w:left w:val="nil"/>
@@ -1459,7 +1481,7 @@
               </w:trPr>
               <w:tc>
                 <w:tcPr>
-                  <w:tcW w:w="4940" w:type="dxa"/>
+                  <w:tcW w:w="4815" w:type="dxa"/>
                   <w:gridSpan w:val="3"/>
                 </w:tcPr>
                 <w:p>
@@ -1486,7 +1508,7 @@
               </w:tc>
               <w:tc>
                 <w:tcPr>
-                  <w:tcW w:w="5855" w:type="dxa"/>
+                  <w:tcW w:w="6300" w:type="dxa"/>
                   <w:gridSpan w:val="4"/>
                 </w:tcPr>
                 <w:p>
@@ -1518,7 +1540,7 @@
               </w:trPr>
               <w:tc>
                 <w:tcPr>
-                  <w:tcW w:w="4940" w:type="dxa"/>
+                  <w:tcW w:w="4815" w:type="dxa"/>
                   <w:gridSpan w:val="3"/>
                   <w:tcBorders>
                     <w:bottom w:val="nil"/>
@@ -1581,7 +1603,7 @@
               </w:tc>
               <w:tc>
                 <w:tcPr>
-                  <w:tcW w:w="5855" w:type="dxa"/>
+                  <w:tcW w:w="6300" w:type="dxa"/>
                   <w:gridSpan w:val="4"/>
                   <w:tcBorders>
                     <w:bottom w:val="nil"/>
@@ -1641,7 +1663,7 @@
               </w:trPr>
               <w:tc>
                 <w:tcPr>
-                  <w:tcW w:w="4940" w:type="dxa"/>
+                  <w:tcW w:w="4815" w:type="dxa"/>
                   <w:gridSpan w:val="3"/>
                   <w:tcBorders>
                     <w:top w:val="nil"/>
@@ -1668,7 +1690,7 @@
               </w:tc>
               <w:tc>
                 <w:tcPr>
-                  <w:tcW w:w="5855" w:type="dxa"/>
+                  <w:tcW w:w="6300" w:type="dxa"/>
                   <w:gridSpan w:val="4"/>
                   <w:tcBorders>
                     <w:top w:val="nil"/>
@@ -1737,7 +1759,7 @@
               </w:trPr>
               <w:tc>
                 <w:tcPr>
-                  <w:tcW w:w="4940" w:type="dxa"/>
+                  <w:tcW w:w="4815" w:type="dxa"/>
                   <w:gridSpan w:val="3"/>
                   <w:tcBorders>
                     <w:top w:val="nil"/>
@@ -1758,7 +1780,7 @@
               </w:tc>
               <w:tc>
                 <w:tcPr>
-                  <w:tcW w:w="5855" w:type="dxa"/>
+                  <w:tcW w:w="6300" w:type="dxa"/>
                   <w:gridSpan w:val="4"/>
                   <w:tcBorders>
                     <w:top w:val="nil"/>
@@ -1827,7 +1849,7 @@
               </w:trPr>
               <w:tc>
                 <w:tcPr>
-                  <w:tcW w:w="4940" w:type="dxa"/>
+                  <w:tcW w:w="4815" w:type="dxa"/>
                   <w:gridSpan w:val="3"/>
                   <w:tcBorders>
                     <w:top w:val="nil"/>
@@ -1848,7 +1870,7 @@
               </w:tc>
               <w:tc>
                 <w:tcPr>
-                  <w:tcW w:w="5855" w:type="dxa"/>
+                  <w:tcW w:w="6300" w:type="dxa"/>
                   <w:gridSpan w:val="4"/>
                   <w:tcBorders>
                     <w:top w:val="nil"/>
@@ -1917,7 +1939,7 @@
               </w:trPr>
               <w:tc>
                 <w:tcPr>
-                  <w:tcW w:w="4940" w:type="dxa"/>
+                  <w:tcW w:w="4815" w:type="dxa"/>
                   <w:gridSpan w:val="3"/>
                   <w:tcBorders>
                     <w:top w:val="nil"/>
@@ -1937,7 +1959,7 @@
               </w:tc>
               <w:tc>
                 <w:tcPr>
-                  <w:tcW w:w="5855" w:type="dxa"/>
+                  <w:tcW w:w="6300" w:type="dxa"/>
                   <w:gridSpan w:val="4"/>
                   <w:tcBorders>
                     <w:top w:val="nil"/>
@@ -2528,6 +2550,16 @@
       </w:tblBorders>
     </w:tblPr>
   </w:style>
+  <w:style w:type="character" w:styleId="PlaceholderText">
+    <w:name w:val="Placeholder Text"/>
+    <w:basedOn w:val="DefaultParagraphFont"/>
+    <w:uiPriority w:val="99"/>
+    <w:semiHidden/>
+    <w:rsid w:val="00661ADB"/>
+    <w:rPr>
+      <w:color w:val="666666"/>
+    </w:rPr>
+  </w:style>
 </w:styles>
 </file>
 
@@ -2824,6 +2856,32 @@
         </w:p>
       </w:docPartBody>
     </w:docPart>
+    <w:docPart>
+      <w:docPartPr>
+        <w:name w:val="DefaultPlaceholder_-1854013440"/>
+        <w:category>
+          <w:name w:val="General"/>
+          <w:gallery w:val="placeholder"/>
+        </w:category>
+        <w:types>
+          <w:type w:val="bbPlcHdr"/>
+        </w:types>
+        <w:behaviors>
+          <w:behavior w:val="content"/>
+        </w:behaviors>
+        <w:guid w:val="{BAE2D098-30C8-4AC4-A3F6-B1CD8CC279A4}"/>
+      </w:docPartPr>
+      <w:docPartBody>
+        <w:p>
+          <w:r>
+            <w:rPr>
+              <w:rStyle w:val="PlaceholderText"/>
+            </w:rPr>
+            <w:t>Click or tap here to enter text.</w:t>
+          </w:r>
+        </w:p>
+      </w:docPartBody>
+    </w:docPart>
   </w:docParts>
 </w:glossaryDocument>
 </file>
@@ -2878,8 +2936,14 @@
   <w:rsids>
     <w:rsidRoot w:val="000174E1"/>
     <w:rsid w:val="000174E1"/>
+    <w:rsid w:val="000F76D5"/>
     <w:rsid w:val="002F6C9F"/>
     <w:rsid w:val="005C3E47"/>
+    <w:rsid w:val="005D50CB"/>
+    <w:rsid w:val="00973507"/>
+    <w:rsid w:val="00E5272E"/>
+    <w:rsid w:val="00F36577"/>
+    <w:rsid w:val="00F558E0"/>
   </w:rsids>
   <m:mathPr>
     <m:mathFont m:val="Cambria Math"/>
@@ -3335,7 +3399,7 @@
     <w:basedOn w:val="DefaultParagraphFont"/>
     <w:uiPriority w:val="99"/>
     <w:semiHidden/>
-    <w:rsid w:val="000174E1"/>
+    <w:rsid w:val="000F76D5"/>
     <w:rPr>
       <w:color w:val="666666"/>
     </w:rPr>
@@ -3687,6 +3751,70 @@
 
 <file path=customXml/item1.xml>��< ? x m l   v e r s i o n = " 1 . 0 "   e n c o d i n g = " u t f - 1 6 " ? > < N a v W o r d R e p o r t X m l P a r t   x m l n s = " u r n : m i c r o s o f t - d y n a m i c s - n a v / r e p o r t s / I n v o i c e T e m p l a t e / 5 0 1 0 4 / " >   
+     < B C R e p o r t I n f o r m a t i o n > + 
+         < R e p o r t M e t a d a t a > + 
+             < E x t e n s i o n I d > E x t e n s i o n   I D < / E x t e n s i o n I d > + 
+             < E x t e n s i o n N a m e > E x t e n s i o n   N a m e < / E x t e n s i o n N a m e > + 
+             < E x t e n s i o n P u b l i s h e r > E x t e n s i o n   P u b l i s h e r < / E x t e n s i o n P u b l i s h e r > + 
+             < E x t e n s i o n V e r s i o n > E x t e n s i o n   V e r s i o n < / E x t e n s i o n V e r s i o n > + 
+             < R e p o r t I d > R e p o r t   I D < / R e p o r t I d > + 
+             < R e p o r t N a m e > R e p o r t   N a m e < / R e p o r t N a m e > + 
+             < A b o u t T h i s R e p o r t T i t l e > A b o u t   T h i s   R e p o r t   T i t l e < / A b o u t T h i s R e p o r t T i t l e > + 
+             < A b o u t T h i s R e p o r t T e x t > A b o u t   T h i s   R e p o r t   T e x t < / A b o u t T h i s R e p o r t T e x t > + 
+             < R e p o r t H e l p L i n k > R e p o r t   H e l p   L i n k < / R e p o r t H e l p L i n k > + 
+         < / R e p o r t M e t a d a t a > + 
+         < R e p o r t R e q u e s t > + 
+             < T e n a n t E n t r a I d > T e n a n t   E n t r a   I d < / T e n a n t E n t r a I d > + 
+             < E n v i r o n m e n t N a m e > E n v i r o n m e n t   N a m e < / E n v i r o n m e n t N a m e > + 
+             < E n v i r o n m e n t T y p e > E n v i r o n m e n t   T y p e < / E n v i r o n m e n t T y p e > + 
+             < C o m p a n y N a m e > C o m p a n y   N a m e < / C o m p a n y N a m e > + 
+             < C o m p a n y D i s p l a y N a m e > C o m p a n y   D i s p l a y   N a m e < / C o m p a n y D i s p l a y N a m e > + 
+             < C o m p a n y I d > C o m p a n y   I D < / C o m p a n y I d > + 
+             < U s e r N a m e > U s e r   N a m e < / U s e r N a m e > + 
+             < D a t e A n d T i m e > D a t e   a n d   T i m e < / D a t e A n d T i m e > + 
+             < L a n g u a g e > L a n g u a g e < / L a n g u a g e > + 
+             < F o r m a t R e g i o n > F o r m a t   R e g i o n < / F o r m a t R e g i o n > + 
+             < D a t e T i m e V a l u e s > + 
+                 < Y e a r > Y e a r < / Y e a r > + 
+                 < M o n t h N u m b e r > M o n t h   N u m b e r < / M o n t h N u m b e r > + 
+                 < D a y N u m b e r > D a y   N u m b e r < / D a y N u m b e r > + 
+                 < H o u r > H o u r < / H o u r > + 
+                 < M i n u t e > M i n u t e < / M i n u t e > + 
+             < / D a t e T i m e V a l u e s > + 
+         < / R e p o r t R e q u e s t > + 
+     < / B C R e p o r t I n f o r m a t i o n > + 
      < S a l e s H e a d e r >   
          < B a n k A c c o u n t N a m e > B a n k A c c o u n t N a m e < / B a n k A c c o u n t N a m e > @@ -3716,6 +3844,8 @@
          < C o m p a n y P i c t u r e > C o m p a n y P i c t u r e < / C o m p a n y P i c t u r e >   
          < C o m p a n y P o s t c o d e > C o m p a n y P o s t c o d e < / C o m p a n y P o s t c o d e > + 
+         < C o m p a n y T R N > C o m p a n y T R N < / C o m p a n y T R N >   
          < C o n t r a c t _ I D > C o n t r a c t _ I D < / C o n t r a c t _ I D >   

</xml_diff>

<commit_message>
Added a chnages in sales invoice and word document Report
</commit_message>
<xml_diff>
--- a/SalesInvoiceTemplate.docx
+++ b/SalesInvoiceTemplate.docx
@@ -10,7 +10,7 @@
         <w:tblLook w:val="04A0" w:firstRow="1" w:lastRow="0" w:firstColumn="1" w:lastColumn="0" w:noHBand="0" w:noVBand="1"/>
       </w:tblPr>
       <w:tblGrid>
-        <w:gridCol w:w="11341"/>
+        <w:gridCol w:w="11420"/>
       </w:tblGrid>
       <w:tr>
         <w:trPr>
@@ -29,19 +29,19 @@
           <w:tbl>
             <w:tblPr>
               <w:tblStyle w:val="TableGrid"/>
-              <w:tblpPr w:leftFromText="180" w:rightFromText="180" w:vertAnchor="page" w:horzAnchor="margin" w:tblpX="137" w:tblpY="295"/>
+              <w:tblpPr w:leftFromText="180" w:rightFromText="180" w:vertAnchor="page" w:horzAnchor="margin" w:tblpY="157"/>
               <w:tblOverlap w:val="never"/>
-              <w:tblW w:w="0" w:type="auto"/>
+              <w:tblW w:w="11194" w:type="dxa"/>
               <w:tblLook w:val="04A0" w:firstRow="1" w:lastRow="0" w:firstColumn="1" w:lastColumn="0" w:noHBand="0" w:noVBand="1"/>
             </w:tblPr>
             <w:tblGrid>
-              <w:gridCol w:w="932"/>
-              <w:gridCol w:w="3807"/>
+              <w:gridCol w:w="1078"/>
+              <w:gridCol w:w="3765"/>
               <w:gridCol w:w="76"/>
-              <w:gridCol w:w="895"/>
-              <w:gridCol w:w="809"/>
-              <w:gridCol w:w="2291"/>
-              <w:gridCol w:w="2305"/>
+              <w:gridCol w:w="892"/>
+              <w:gridCol w:w="801"/>
+              <w:gridCol w:w="2214"/>
+              <w:gridCol w:w="2368"/>
             </w:tblGrid>
             <w:tr>
               <w:trPr>
@@ -69,7 +69,7 @@
                       <w:tag w:val="#Nav: InvoiceTemplate/50104"/>
                       <w:id w:val="508260734"/>
                       <w:placeholder>
-                        <w:docPart w:val="C2BDB527C8E949F98FC80043B13D2D92"/>
+                        <w:docPart w:val="CA6389120CB44DEE901BCFE487589570"/>
                       </w:placeholder>
                       <w:dataBinding w:prefixMappings="xmlns:ns0='urn:microsoft-dynamics-nav/reports/InvoiceTemplate/50104/'" w:xpath="/ns0:NavWordReportXmlPart[1]/ns0:SalesHeader[1]/ns0:CompanyName[1]" w:storeItemID="{8BA33C80-C320-484C-9EE6-B028EA57E99B}"/>
                       <w:text/>
@@ -92,7 +92,7 @@
               </w:tc>
               <w:tc>
                 <w:tcPr>
-                  <w:tcW w:w="6300" w:type="dxa"/>
+                  <w:tcW w:w="6379" w:type="dxa"/>
                   <w:gridSpan w:val="4"/>
                   <w:tcBorders>
                     <w:left w:val="nil"/>
@@ -128,7 +128,7 @@
                   <w:tag w:val="#Nav: InvoiceTemplate/50104"/>
                   <w:id w:val="-509370180"/>
                   <w:placeholder>
-                    <w:docPart w:val="C2BDB527C8E949F98FC80043B13D2D92"/>
+                    <w:docPart w:val="CA6389120CB44DEE901BCFE487589570"/>
                   </w:placeholder>
                   <w:dataBinding w:prefixMappings="xmlns:ns0='urn:microsoft-dynamics-nav/reports/InvoiceTemplate/50104/'" w:xpath="/ns0:NavWordReportXmlPart[1]/ns0:SalesHeader[1]/ns0:CompanyAddress[1]" w:storeItemID="{8BA33C80-C320-484C-9EE6-B028EA57E99B}"/>
                   <w:text/>
@@ -165,7 +165,7 @@
                 <w:sdtContent>
                   <w:tc>
                     <w:tcPr>
-                      <w:tcW w:w="6300" w:type="dxa"/>
+                      <w:tcW w:w="6379" w:type="dxa"/>
                       <w:gridSpan w:val="4"/>
                       <w:vMerge w:val="restart"/>
                       <w:tcBorders>
@@ -184,9 +184,9 @@
                           <w:noProof/>
                         </w:rPr>
                         <w:drawing>
-                          <wp:inline distT="0" distB="0" distL="0" distR="0" wp14:anchorId="5807A505" wp14:editId="5950B520">
-                            <wp:extent cx="1859280" cy="1043940"/>
-                            <wp:effectExtent l="0" t="0" r="7620" b="3810"/>
+                          <wp:inline distT="0" distB="0" distL="0" distR="0" wp14:anchorId="779776EE" wp14:editId="2B2760BF">
+                            <wp:extent cx="2255520" cy="1043940"/>
+                            <wp:effectExtent l="0" t="0" r="0" b="3810"/>
                             <wp:docPr id="2" name="Picture 1"/>
                             <wp:cNvGraphicFramePr>
                               <a:graphicFrameLocks xmlns:a="http://schemas.openxmlformats.org/drawingml/2006/main" noChangeAspect="1"/>
@@ -209,7 +209,7 @@
                                   <pic:spPr bwMode="auto">
                                     <a:xfrm>
                                       <a:off x="0" y="0"/>
-                                      <a:ext cx="1859820" cy="1044243"/>
+                                      <a:ext cx="2256180" cy="1044245"/>
                                     </a:xfrm>
                                     <a:prstGeom prst="rect">
                                       <a:avLst/>
@@ -248,7 +248,7 @@
                       <w:tag w:val="#Nav: InvoiceTemplate/50104"/>
                       <w:id w:val="-202869147"/>
                       <w:placeholder>
-                        <w:docPart w:val="C2BDB527C8E949F98FC80043B13D2D92"/>
+                        <w:docPart w:val="CA6389120CB44DEE901BCFE487589570"/>
                       </w:placeholder>
                       <w:dataBinding w:prefixMappings="xmlns:ns0='urn:microsoft-dynamics-nav/reports/InvoiceTemplate/50104/'" w:xpath="/ns0:NavWordReportXmlPart[1]/ns0:SalesHeader[1]/ns0:CompanyCity[1]" w:storeItemID="{8BA33C80-C320-484C-9EE6-B028EA57E99B}"/>
                       <w:text/>
@@ -269,7 +269,7 @@
                       <w:tag w:val="#Nav: InvoiceTemplate/50104"/>
                       <w:id w:val="1969545149"/>
                       <w:placeholder>
-                        <w:docPart w:val="C2BDB527C8E949F98FC80043B13D2D92"/>
+                        <w:docPart w:val="CA6389120CB44DEE901BCFE487589570"/>
                       </w:placeholder>
                       <w:dataBinding w:prefixMappings="xmlns:ns0='urn:microsoft-dynamics-nav/reports/InvoiceTemplate/50104/'" w:xpath="/ns0:NavWordReportXmlPart[1]/ns0:SalesHeader[1]/ns0:CompanyPostcode[1]" w:storeItemID="{8BA33C80-C320-484C-9EE6-B028EA57E99B}"/>
                       <w:text/>
@@ -289,7 +289,7 @@
                       <w:tag w:val="#Nav: InvoiceTemplate/50104"/>
                       <w:id w:val="-624153138"/>
                       <w:placeholder>
-                        <w:docPart w:val="C2BDB527C8E949F98FC80043B13D2D92"/>
+                        <w:docPart w:val="CA6389120CB44DEE901BCFE487589570"/>
                       </w:placeholder>
                       <w:dataBinding w:prefixMappings="xmlns:ns0='urn:microsoft-dynamics-nav/reports/InvoiceTemplate/50104/'" w:xpath="/ns0:NavWordReportXmlPart[1]/ns0:SalesHeader[1]/ns0:CompanyCountry[1]" w:storeItemID="{8BA33C80-C320-484C-9EE6-B028EA57E99B}"/>
                       <w:text/>
@@ -305,7 +305,7 @@
               </w:tc>
               <w:tc>
                 <w:tcPr>
-                  <w:tcW w:w="6300" w:type="dxa"/>
+                  <w:tcW w:w="6379" w:type="dxa"/>
                   <w:gridSpan w:val="4"/>
                   <w:vMerge/>
                   <w:tcBorders>
@@ -339,7 +339,7 @@
                       <w:tag w:val="#Nav: InvoiceTemplate/50104"/>
                       <w:id w:val="-1674724242"/>
                       <w:placeholder>
-                        <w:docPart w:val="C2BDB527C8E949F98FC80043B13D2D92"/>
+                        <w:docPart w:val="CA6389120CB44DEE901BCFE487589570"/>
                       </w:placeholder>
                       <w:dataBinding w:prefixMappings="xmlns:ns0='urn:microsoft-dynamics-nav/reports/InvoiceTemplate/50104/'" w:xpath="/ns0:NavWordReportXmlPart[1]/ns0:SalesHeader[1]/ns0:CompanyPhone[1]" w:storeItemID="{8BA33C80-C320-484C-9EE6-B028EA57E99B}"/>
                       <w:text/>
@@ -356,7 +356,7 @@
               </w:tc>
               <w:tc>
                 <w:tcPr>
-                  <w:tcW w:w="6300" w:type="dxa"/>
+                  <w:tcW w:w="6379" w:type="dxa"/>
                   <w:gridSpan w:val="4"/>
                   <w:vMerge/>
                   <w:tcBorders>
@@ -390,7 +390,7 @@
                       <w:tag w:val="#Nav: InvoiceTemplate/50104"/>
                       <w:id w:val="-85077356"/>
                       <w:placeholder>
-                        <w:docPart w:val="C2BDB527C8E949F98FC80043B13D2D92"/>
+                        <w:docPart w:val="CA6389120CB44DEE901BCFE487589570"/>
                       </w:placeholder>
                       <w:dataBinding w:prefixMappings="xmlns:ns0='urn:microsoft-dynamics-nav/reports/InvoiceTemplate/50104/'" w:xpath="/ns0:NavWordReportXmlPart[1]/ns0:SalesHeader[1]/ns0:CompanyEmail[1]" w:storeItemID="{8BA33C80-C320-484C-9EE6-B028EA57E99B}"/>
                       <w:text/>
@@ -407,7 +407,7 @@
               </w:tc>
               <w:tc>
                 <w:tcPr>
-                  <w:tcW w:w="6300" w:type="dxa"/>
+                  <w:tcW w:w="6379" w:type="dxa"/>
                   <w:gridSpan w:val="4"/>
                   <w:vMerge/>
                   <w:tcBorders>
@@ -433,21 +433,18 @@
                 </w:tcPr>
                 <w:p>
                   <w:r>
-                    <w:t>TRN:</w:t>
-                  </w:r>
-                  <w:r>
-                    <w:t xml:space="preserve"> </w:t>
+                    <w:t xml:space="preserve">TRN: </w:t>
                   </w:r>
                   <w:sdt>
                     <w:sdtPr>
+                      <w:alias w:val="#Nav: /SalesHeader/CompanyTRN"/>
+                      <w:tag w:val="#Nav: InvoiceTemplate/50104"/>
                       <w:id w:val="-131709380"/>
                       <w:placeholder>
-                        <w:docPart w:val="DefaultPlaceholder_-1854013440"/>
+                        <w:docPart w:val="5E1389E8ADA3429FA16E0508CAC6326D"/>
                       </w:placeholder>
                       <w:dataBinding w:prefixMappings="xmlns:ns0='urn:microsoft-dynamics-nav/reports/InvoiceTemplate/50104/'" w:xpath="/ns0:NavWordReportXmlPart[1]/ns0:SalesHeader[1]/ns0:CompanyTRN[1]" w:storeItemID="{8BA33C80-C320-484C-9EE6-B028EA57E99B}"/>
                       <w:text/>
-                      <w:alias w:val="#Nav: /SalesHeader/CompanyTRN"/>
-                      <w:tag w:val="#Nav: InvoiceTemplate/50104"/>
                     </w:sdtPr>
                     <w:sdtContent>
                       <w:proofErr w:type="spellStart"/>
@@ -461,7 +458,7 @@
               </w:tc>
               <w:tc>
                 <w:tcPr>
-                  <w:tcW w:w="6300" w:type="dxa"/>
+                  <w:tcW w:w="6379" w:type="dxa"/>
                   <w:gridSpan w:val="4"/>
                   <w:vMerge/>
                   <w:tcBorders>
@@ -477,7 +474,7 @@
             <w:tr>
               <w:tc>
                 <w:tcPr>
-                  <w:tcW w:w="11115" w:type="dxa"/>
+                  <w:tcW w:w="11194" w:type="dxa"/>
                   <w:gridSpan w:val="7"/>
                   <w:tcBorders>
                     <w:top w:val="nil"/>
@@ -505,7 +502,7 @@
                       <w:tag w:val="#Nav: InvoiceTemplate/50104"/>
                       <w:id w:val="-2123600258"/>
                       <w:placeholder>
-                        <w:docPart w:val="C8226EF33CE0421893D6D82A3D493C28"/>
+                        <w:docPart w:val="60169553AAE34F98A47E6F59645076B7"/>
                       </w:placeholder>
                       <w:dataBinding w:prefixMappings="xmlns:ns0='urn:microsoft-dynamics-nav/reports/InvoiceTemplate/50104/'" w:xpath="/ns0:NavWordReportXmlPart[1]/ns0:SalesHeader[1]/ns0:No_[1]" w:storeItemID="{8BA33C80-C320-484C-9EE6-B028EA57E99B}"/>
                       <w:text/>
@@ -520,7 +517,7 @@
               </w:tc>
               <w:tc>
                 <w:tcPr>
-                  <w:tcW w:w="6300" w:type="dxa"/>
+                  <w:tcW w:w="6379" w:type="dxa"/>
                   <w:gridSpan w:val="4"/>
                   <w:tcBorders>
                     <w:bottom w:val="nil"/>
@@ -536,7 +533,7 @@
                       <w:tag w:val="#Nav: InvoiceTemplate/50104"/>
                       <w:id w:val="-164478636"/>
                       <w:placeholder>
-                        <w:docPart w:val="C2BDB527C8E949F98FC80043B13D2D92"/>
+                        <w:docPart w:val="CA6389120CB44DEE901BCFE487589570"/>
                       </w:placeholder>
                       <w:dataBinding w:prefixMappings="xmlns:ns0='urn:microsoft-dynamics-nav/reports/InvoiceTemplate/50104/'" w:xpath="/ns0:NavWordReportXmlPart[1]/ns0:SalesHeader[1]/ns0:Customer_P_O[1]" w:storeItemID="{8BA33C80-C320-484C-9EE6-B028EA57E99B}"/>
                       <w:text/>
@@ -572,7 +569,7 @@
                       <w:tag w:val="#Nav: InvoiceTemplate/50104"/>
                       <w:id w:val="327259473"/>
                       <w:placeholder>
-                        <w:docPart w:val="57C2D6F4C5AE428EA0DFE920DF61FA35"/>
+                        <w:docPart w:val="E2EC4E3FB0114F2A87D748090CBA06A0"/>
                       </w:placeholder>
                       <w:dataBinding w:prefixMappings="xmlns:ns0='urn:microsoft-dynamics-nav/reports/InvoiceTemplate/50104/'" w:xpath="/ns0:NavWordReportXmlPart[1]/ns0:SalesHeader[1]/ns0:Posting_Date[1]" w:storeItemID="{8BA33C80-C320-484C-9EE6-B028EA57E99B}"/>
                       <w:text/>
@@ -589,7 +586,7 @@
               </w:tc>
               <w:tc>
                 <w:tcPr>
-                  <w:tcW w:w="6300" w:type="dxa"/>
+                  <w:tcW w:w="6379" w:type="dxa"/>
                   <w:gridSpan w:val="4"/>
                   <w:tcBorders>
                     <w:top w:val="nil"/>
@@ -606,7 +603,7 @@
                       <w:tag w:val="#Nav: InvoiceTemplate/50104"/>
                       <w:id w:val="723876018"/>
                       <w:placeholder>
-                        <w:docPart w:val="C2BDB527C8E949F98FC80043B13D2D92"/>
+                        <w:docPart w:val="CA6389120CB44DEE901BCFE487589570"/>
                       </w:placeholder>
                       <w:dataBinding w:prefixMappings="xmlns:ns0='urn:microsoft-dynamics-nav/reports/InvoiceTemplate/50104/'" w:xpath="/ns0:NavWordReportXmlPart[1]/ns0:SalesHeader[1]/ns0:Customer_P_O_Date[1]" w:storeItemID="{8BA33C80-C320-484C-9EE6-B028EA57E99B}"/>
                       <w:text/>
@@ -625,7 +622,7 @@
             <w:tr>
               <w:tc>
                 <w:tcPr>
-                  <w:tcW w:w="11115" w:type="dxa"/>
+                  <w:tcW w:w="11194" w:type="dxa"/>
                   <w:gridSpan w:val="7"/>
                   <w:tcBorders>
                     <w:left w:val="nil"/>
@@ -638,7 +635,7 @@
             <w:tr>
               <w:tc>
                 <w:tcPr>
-                  <w:tcW w:w="11115" w:type="dxa"/>
+                  <w:tcW w:w="11194" w:type="dxa"/>
                   <w:gridSpan w:val="7"/>
                   <w:shd w:val="clear" w:color="auto" w:fill="00B0F0"/>
                 </w:tcPr>
@@ -673,7 +670,7 @@
                   <w:tag w:val="#Nav: InvoiceTemplate/50104"/>
                   <w:id w:val="-1129711236"/>
                   <w:placeholder>
-                    <w:docPart w:val="551E7278097D490895F6E2D72FCD3727"/>
+                    <w:docPart w:val="1C725278194D40A28F1C7D034414B69B"/>
                   </w:placeholder>
                   <w:dataBinding w:prefixMappings="xmlns:ns0='urn:microsoft-dynamics-nav/reports/InvoiceTemplate/50104/'" w:xpath="/ns0:NavWordReportXmlPart[1]/ns0:SalesHeader[1]/ns0:Sell_to_Customer_Name[1]" w:storeItemID="{8BA33C80-C320-484C-9EE6-B028EA57E99B}"/>
                   <w:text/>
@@ -703,7 +700,7 @@
               </w:sdt>
               <w:tc>
                 <w:tcPr>
-                  <w:tcW w:w="6300" w:type="dxa"/>
+                  <w:tcW w:w="6379" w:type="dxa"/>
                   <w:gridSpan w:val="4"/>
                   <w:tcBorders>
                     <w:bottom w:val="nil"/>
@@ -719,7 +716,7 @@
                       <w:tag w:val="#Nav: InvoiceTemplate/50104"/>
                       <w:id w:val="1219011095"/>
                       <w:placeholder>
-                        <w:docPart w:val="C2BDB527C8E949F98FC80043B13D2D92"/>
+                        <w:docPart w:val="CA6389120CB44DEE901BCFE487589570"/>
                       </w:placeholder>
                       <w:dataBinding w:prefixMappings="xmlns:ns0='urn:microsoft-dynamics-nav/reports/InvoiceTemplate/50104/'" w:xpath="/ns0:NavWordReportXmlPart[1]/ns0:SalesHeader[1]/ns0:Contract_ID[1]" w:storeItemID="{8BA33C80-C320-484C-9EE6-B028EA57E99B}"/>
                       <w:text/>
@@ -745,7 +742,7 @@
                   <w:tag w:val="#Nav: InvoiceTemplate/50104"/>
                   <w:id w:val="475577444"/>
                   <w:placeholder>
-                    <w:docPart w:val="16A3537A7C2846D1A278A0043FB728C7"/>
+                    <w:docPart w:val="A8DB9F97F4844D4BA1F43501635BFAB4"/>
                   </w:placeholder>
                   <w:dataBinding w:prefixMappings="xmlns:ns0='urn:microsoft-dynamics-nav/reports/InvoiceTemplate/50104/'" w:xpath="/ns0:NavWordReportXmlPart[1]/ns0:SalesHeader[1]/ns0:Bill_to_Address[1]" w:storeItemID="{8BA33C80-C320-484C-9EE6-B028EA57E99B}"/>
                   <w:text/>
@@ -772,7 +769,7 @@
               </w:sdt>
               <w:tc>
                 <w:tcPr>
-                  <w:tcW w:w="6300" w:type="dxa"/>
+                  <w:tcW w:w="6379" w:type="dxa"/>
                   <w:gridSpan w:val="4"/>
                   <w:tcBorders>
                     <w:top w:val="nil"/>
@@ -789,7 +786,7 @@
                       <w:tag w:val="#Nav: InvoiceTemplate/50104"/>
                       <w:id w:val="-1616821467"/>
                       <w:placeholder>
-                        <w:docPart w:val="C2BDB527C8E949F98FC80043B13D2D92"/>
+                        <w:docPart w:val="CA6389120CB44DEE901BCFE487589570"/>
                       </w:placeholder>
                       <w:dataBinding w:prefixMappings="xmlns:ns0='urn:microsoft-dynamics-nav/reports/InvoiceTemplate/50104/'" w:xpath="/ns0:NavWordReportXmlPart[1]/ns0:SalesHeader[1]/ns0:Tenancy_Contract[1]/ns0:Property_Name[1]" w:storeItemID="{8BA33C80-C320-484C-9EE6-B028EA57E99B}"/>
                       <w:text/>
@@ -828,7 +825,7 @@
                       <w:tag w:val="#Nav: InvoiceTemplate/50104"/>
                       <w:id w:val="1278680020"/>
                       <w:placeholder>
-                        <w:docPart w:val="B9D69747DC2A45A5812E8E7CBBD2B152"/>
+                        <w:docPart w:val="FA39F9D4505C400998C46A4D14FBE3DD"/>
                       </w:placeholder>
                       <w:dataBinding w:prefixMappings="xmlns:ns0='urn:microsoft-dynamics-nav/reports/InvoiceTemplate/50104/'" w:xpath="/ns0:NavWordReportXmlPart[1]/ns0:SalesHeader[1]/ns0:Sell_to_Phone_No_[1]" w:storeItemID="{8BA33C80-C320-484C-9EE6-B028EA57E99B}"/>
                       <w:text/>
@@ -848,7 +845,7 @@
               </w:tc>
               <w:tc>
                 <w:tcPr>
-                  <w:tcW w:w="6300" w:type="dxa"/>
+                  <w:tcW w:w="6379" w:type="dxa"/>
                   <w:gridSpan w:val="4"/>
                   <w:tcBorders>
                     <w:top w:val="nil"/>
@@ -865,7 +862,7 @@
                       <w:tag w:val="#Nav: InvoiceTemplate/50104"/>
                       <w:id w:val="-525949119"/>
                       <w:placeholder>
-                        <w:docPart w:val="C2BDB527C8E949F98FC80043B13D2D92"/>
+                        <w:docPart w:val="CA6389120CB44DEE901BCFE487589570"/>
                       </w:placeholder>
                       <w:dataBinding w:prefixMappings="xmlns:ns0='urn:microsoft-dynamics-nav/reports/InvoiceTemplate/50104/'" w:xpath="/ns0:NavWordReportXmlPart[1]/ns0:SalesHeader[1]/ns0:Tenancy_Contract[1]/ns0:Unit_Name[1]" w:storeItemID="{8BA33C80-C320-484C-9EE6-B028EA57E99B}"/>
                       <w:text/>
@@ -904,7 +901,7 @@
                       <w:tag w:val="#Nav: InvoiceTemplate/50104"/>
                       <w:id w:val="-1099019837"/>
                       <w:placeholder>
-                        <w:docPart w:val="32B1CDCF6FDB4F27A7906890AA1EFF94"/>
+                        <w:docPart w:val="F5CE5E398A3F420B906A2C1DE1949DC7"/>
                       </w:placeholder>
                       <w:dataBinding w:prefixMappings="xmlns:ns0='urn:microsoft-dynamics-nav/reports/InvoiceTemplate/50104/'" w:xpath="/ns0:NavWordReportXmlPart[1]/ns0:SalesHeader[1]/ns0:Sell_to_E_Mail[1]" w:storeItemID="{8BA33C80-C320-484C-9EE6-B028EA57E99B}"/>
                       <w:text/>
@@ -921,7 +918,7 @@
               </w:tc>
               <w:tc>
                 <w:tcPr>
-                  <w:tcW w:w="6300" w:type="dxa"/>
+                  <w:tcW w:w="6379" w:type="dxa"/>
                   <w:gridSpan w:val="4"/>
                   <w:tcBorders>
                     <w:top w:val="nil"/>
@@ -938,7 +935,7 @@
                       <w:tag w:val="#Nav: InvoiceTemplate/50104"/>
                       <w:id w:val="1601063237"/>
                       <w:placeholder>
-                        <w:docPart w:val="C2BDB527C8E949F98FC80043B13D2D92"/>
+                        <w:docPart w:val="CA6389120CB44DEE901BCFE487589570"/>
                       </w:placeholder>
                       <w:dataBinding w:prefixMappings="xmlns:ns0='urn:microsoft-dynamics-nav/reports/InvoiceTemplate/50104/'" w:xpath="/ns0:NavWordReportXmlPart[1]/ns0:SalesHeader[1]/ns0:Contract_Period[1]" w:storeItemID="{8BA33C80-C320-484C-9EE6-B028EA57E99B}"/>
                       <w:text/>
@@ -976,7 +973,7 @@
                       <w:tag w:val="#Nav: InvoiceTemplate/50104"/>
                       <w:id w:val="-1290282460"/>
                       <w:placeholder>
-                        <w:docPart w:val="D5DA0457797248D5A4C046B1B1E8F750"/>
+                        <w:docPart w:val="6C7ABCEF01C5406CA0CEC59563BEE7AA"/>
                       </w:placeholder>
                       <w:dataBinding w:prefixMappings="xmlns:ns0='urn:microsoft-dynamics-nav/reports/InvoiceTemplate/50104/'" w:xpath="/ns0:NavWordReportXmlPart[1]/ns0:SalesHeader[1]/ns0:VAT_Registration_No_[1]" w:storeItemID="{8BA33C80-C320-484C-9EE6-B028EA57E99B}"/>
                       <w:text/>
@@ -996,7 +993,7 @@
               </w:tc>
               <w:tc>
                 <w:tcPr>
-                  <w:tcW w:w="6300" w:type="dxa"/>
+                  <w:tcW w:w="6379" w:type="dxa"/>
                   <w:gridSpan w:val="4"/>
                   <w:tcBorders>
                     <w:top w:val="nil"/>
@@ -1012,7 +1009,7 @@
                       <w:tag w:val="#Nav: InvoiceTemplate/50104"/>
                       <w:id w:val="-172646885"/>
                       <w:placeholder>
-                        <w:docPart w:val="C2BDB527C8E949F98FC80043B13D2D92"/>
+                        <w:docPart w:val="CA6389120CB44DEE901BCFE487589570"/>
                       </w:placeholder>
                       <w:dataBinding w:prefixMappings="xmlns:ns0='urn:microsoft-dynamics-nav/reports/InvoiceTemplate/50104/'" w:xpath="/ns0:NavWordReportXmlPart[1]/ns0:SalesHeader[1]/ns0:Tenancy_Contract[1]/ns0:Contract_Tenor[1]" w:storeItemID="{8BA33C80-C320-484C-9EE6-B028EA57E99B}"/>
                       <w:text/>
@@ -1034,7 +1031,7 @@
               </w:trPr>
               <w:tc>
                 <w:tcPr>
-                  <w:tcW w:w="11115" w:type="dxa"/>
+                  <w:tcW w:w="11194" w:type="dxa"/>
                   <w:gridSpan w:val="7"/>
                 </w:tcPr>
                 <w:p/>
@@ -1152,7 +1149,7 @@
               </w:tc>
               <w:tc>
                 <w:tcPr>
-                  <w:tcW w:w="2305" w:type="dxa"/>
+                  <w:tcW w:w="2384" w:type="dxa"/>
                   <w:shd w:val="clear" w:color="auto" w:fill="00B0F0"/>
                 </w:tcPr>
                 <w:p>
@@ -1177,7 +1174,7 @@
                 <w:alias w:val="#Nav: /SalesHeader/Sales_Line"/>
                 <w:tag w:val="#Nav: InvoiceTemplate/50104"/>
                 <w:id w:val="1820616093"/>
-                <w15:dataBinding w:prefixMappings="xmlns:ns0='urn:microsoft-dynamics-nav/reports/InvoiceTemplate/50104/'" w:xpath="/ns0:NavWordReportXmlPart[1]/ns0:SalesHeader[1]/ns0:Sales_Line" w:storeItemID="{8BA33C80-C320-484C-9EE6-B028EA57E99B}"/>
+                <w15:dataBinding w:prefixMappings="xmlns:ns0='urn:microsoft-dynamics-nav/reports/InvoiceTemplate/50104/' " w:xpath="/ns0:NavWordReportXmlPart[1]/ns0:SalesHeader[1]/ns0:Sales_Line" w:storeItemID="{8BA33C80-C320-484C-9EE6-B028EA57E99B}"/>
                 <w15:repeatingSection/>
               </w:sdtPr>
               <w:sdtContent>
@@ -1185,7 +1182,7 @@
                   <w:sdtPr>
                     <w:id w:val="-1365979312"/>
                     <w:placeholder>
-                      <w:docPart w:val="CE87644AA2F24C7F9C0835480F79C23D"/>
+                      <w:docPart w:val="F005E960139B49DDA97AEA8072800EEB"/>
                     </w:placeholder>
                     <w15:repeatingSectionItem/>
                   </w:sdtPr>
@@ -1194,19 +1191,40 @@
                       <w:trPr>
                         <w:trHeight w:val="250"/>
                       </w:trPr>
-                      <w:tc>
-                        <w:tcPr>
-                          <w:tcW w:w="932" w:type="dxa"/>
-                        </w:tcPr>
-                        <w:p/>
-                      </w:tc>
+                      <w:sdt>
+                        <w:sdtPr>
+                          <w:id w:val="-389886225"/>
+                          <w:placeholder>
+                            <w:docPart w:val="DefaultPlaceholder_-1854013440"/>
+                          </w:placeholder>
+                          <w:dataBinding w:prefixMappings="xmlns:ns0='urn:microsoft-dynamics-nav/reports/InvoiceTemplate/50104/' " w:xpath="/ns0:NavWordReportXmlPart[1]/ns0:SalesHeader[1]/ns0:Sales_Line[1]/ns0:Serial_No[1]" w:storeItemID="{8BA33C80-C320-484C-9EE6-B028EA57E99B}"/>
+                          <w:text/>
+                          <w:alias w:val="#Nav: /SalesHeader/Sales_Line/Serial_No"/>
+                          <w:tag w:val="#Nav: InvoiceTemplate/50104"/>
+                        </w:sdtPr>
+                        <w:sdtEndPr/>
+                        <w:sdtContent>
+                          <w:tc>
+                            <w:tcPr>
+                              <w:tcW w:w="932" w:type="dxa"/>
+                            </w:tcPr>
+                            <w:p>
+                              <w:proofErr w:type="spellStart"/>
+                              <w:r>
+                                <w:t>Serial_No</w:t>
+                              </w:r>
+                              <w:proofErr w:type="spellEnd"/>
+                            </w:p>
+                          </w:tc>
+                        </w:sdtContent>
+                      </w:sdt>
                       <w:sdt>
                         <w:sdtPr>
                           <w:alias w:val="#Nav: /SalesHeader/Sales_Line/Description"/>
                           <w:tag w:val="#Nav: InvoiceTemplate/50104"/>
                           <w:id w:val="1185473002"/>
                           <w:placeholder>
-                            <w:docPart w:val="C2BDB527C8E949F98FC80043B13D2D92"/>
+                            <w:docPart w:val="CA6389120CB44DEE901BCFE487589570"/>
                           </w:placeholder>
                           <w:dataBinding w:prefixMappings="xmlns:ns0='urn:microsoft-dynamics-nav/reports/InvoiceTemplate/50104/'" w:xpath="/ns0:NavWordReportXmlPart[1]/ns0:SalesHeader[1]/ns0:Sales_Line[1]/ns0:Description[1]" w:storeItemID="{8BA33C80-C320-484C-9EE6-B028EA57E99B}"/>
                           <w:text/>
@@ -1230,7 +1248,7 @@
                           <w:tag w:val="#Nav: InvoiceTemplate/50104"/>
                           <w:id w:val="1429164200"/>
                           <w:placeholder>
-                            <w:docPart w:val="C2BDB527C8E949F98FC80043B13D2D92"/>
+                            <w:docPart w:val="CA6389120CB44DEE901BCFE487589570"/>
                           </w:placeholder>
                           <w:dataBinding w:prefixMappings="xmlns:ns0='urn:microsoft-dynamics-nav/reports/InvoiceTemplate/50104/'" w:xpath="/ns0:NavWordReportXmlPart[1]/ns0:SalesHeader[1]/ns0:Sales_Line[1]/ns0:Amount[1]" w:storeItemID="{8BA33C80-C320-484C-9EE6-B028EA57E99B}"/>
                           <w:text/>
@@ -1255,7 +1273,7 @@
                           <w:tag w:val="#Nav: InvoiceTemplate/50104"/>
                           <w:id w:val="-818420010"/>
                           <w:placeholder>
-                            <w:docPart w:val="C2BDB527C8E949F98FC80043B13D2D92"/>
+                            <w:docPart w:val="CA6389120CB44DEE901BCFE487589570"/>
                           </w:placeholder>
                           <w:dataBinding w:prefixMappings="xmlns:ns0='urn:microsoft-dynamics-nav/reports/InvoiceTemplate/50104/'" w:xpath="/ns0:NavWordReportXmlPart[1]/ns0:SalesHeader[1]/ns0:Sales_Line[1]/ns0:VAT__[1]" w:storeItemID="{8BA33C80-C320-484C-9EE6-B028EA57E99B}"/>
                           <w:text/>
@@ -1279,7 +1297,7 @@
                           <w:tag w:val="#Nav: InvoiceTemplate/50104"/>
                           <w:id w:val="-1459408842"/>
                           <w:placeholder>
-                            <w:docPart w:val="C2BDB527C8E949F98FC80043B13D2D92"/>
+                            <w:docPart w:val="CA6389120CB44DEE901BCFE487589570"/>
                           </w:placeholder>
                           <w:dataBinding w:prefixMappings="xmlns:ns0='urn:microsoft-dynamics-nav/reports/InvoiceTemplate/50104/'" w:xpath="/ns0:NavWordReportXmlPart[1]/ns0:SalesHeader[1]/ns0:Sales_Line[1]/ns0:VAT_Base_Amount[1]" w:storeItemID="{8BA33C80-C320-484C-9EE6-B028EA57E99B}"/>
                           <w:text/>
@@ -1305,7 +1323,7 @@
                           <w:tag w:val="#Nav: InvoiceTemplate/50104"/>
                           <w:id w:val="1850298248"/>
                           <w:placeholder>
-                            <w:docPart w:val="C2BDB527C8E949F98FC80043B13D2D92"/>
+                            <w:docPart w:val="CA6389120CB44DEE901BCFE487589570"/>
                           </w:placeholder>
                           <w:dataBinding w:prefixMappings="xmlns:ns0='urn:microsoft-dynamics-nav/reports/InvoiceTemplate/50104/'" w:xpath="/ns0:NavWordReportXmlPart[1]/ns0:SalesHeader[1]/ns0:Sales_Line[1]/ns0:Amount_Including_VAT[1]" w:storeItemID="{8BA33C80-C320-484C-9EE6-B028EA57E99B}"/>
                           <w:text/>
@@ -1313,7 +1331,7 @@
                         <w:sdtContent>
                           <w:tc>
                             <w:tcPr>
-                              <w:tcW w:w="2305" w:type="dxa"/>
+                              <w:tcW w:w="2384" w:type="dxa"/>
                             </w:tcPr>
                             <w:p>
                               <w:proofErr w:type="spellStart"/>
@@ -1406,7 +1424,7 @@
                   <w:tag w:val="#Nav: InvoiceTemplate/50104"/>
                   <w:id w:val="-663543211"/>
                   <w:placeholder>
-                    <w:docPart w:val="C2BDB527C8E949F98FC80043B13D2D92"/>
+                    <w:docPart w:val="CA6389120CB44DEE901BCFE487589570"/>
                   </w:placeholder>
                   <w:dataBinding w:prefixMappings="xmlns:ns0='urn:microsoft-dynamics-nav/reports/InvoiceTemplate/50104/'" w:xpath="/ns0:NavWordReportXmlPart[1]/ns0:SalesHeader[1]/ns0:Totals[1]/ns0:TotalAmountInclVAT[1]" w:storeItemID="{8BA33C80-C320-484C-9EE6-B028EA57E99B}"/>
                   <w:text/>
@@ -1414,7 +1432,7 @@
                 <w:sdtContent>
                   <w:tc>
                     <w:tcPr>
-                      <w:tcW w:w="2305" w:type="dxa"/>
+                      <w:tcW w:w="2384" w:type="dxa"/>
                     </w:tcPr>
                     <w:p>
                       <w:pPr>
@@ -1436,7 +1454,7 @@
               </w:trPr>
               <w:tc>
                 <w:tcPr>
-                  <w:tcW w:w="11115" w:type="dxa"/>
+                  <w:tcW w:w="11194" w:type="dxa"/>
                   <w:gridSpan w:val="7"/>
                   <w:tcBorders>
                     <w:bottom w:val="single" w:color="auto" w:sz="4" w:space="0"/>
@@ -1449,6 +1467,55 @@
                       <w:bCs/>
                     </w:rPr>
                   </w:pPr>
+                  <w:r>
+                    <w:rPr>
+                      <w:b/>
+                      <w:bCs/>
+                    </w:rPr>
+                    <w:t>Total (In words</w:t>
+                  </w:r>
+                  <w:proofErr w:type="gramStart"/>
+                  <w:r>
+                    <w:rPr>
+                      <w:b/>
+                      <w:bCs/>
+                    </w:rPr>
+                    <w:t>)</w:t>
+                  </w:r>
+                  <w:r>
+                    <w:rPr>
+                      <w:b/>
+                      <w:bCs/>
+                    </w:rPr>
+                    <w:t xml:space="preserve"> :</w:t>
+                  </w:r>
+                  <w:proofErr w:type="gramEnd"/>
+                  <w:r>
+                    <w:rPr>
+                      <w:b/>
+                      <w:bCs/>
+                    </w:rPr>
+                    <w:t xml:space="preserve"> </w:t>
+                  </w:r>
+                  <w:sdt>
+                    <w:sdtPr>
+                      <w:id w:val="-574812290"/>
+                      <w:placeholder>
+                        <w:docPart w:val="DefaultPlaceholder_-1854013440"/>
+                      </w:placeholder>
+                      <w:dataBinding w:prefixMappings="xmlns:ns0='urn:microsoft-dynamics-nav/reports/InvoiceTemplate/50104/' " w:xpath="/ns0:NavWordReportXmlPart[1]/ns0:SalesHeader[1]/ns0:Totals[1]/ns0:AmountInWords[1]" w:storeItemID="{8BA33C80-C320-484C-9EE6-B028EA57E99B}"/>
+                      <w:text/>
+                      <w:alias w:val="#Nav: /SalesHeader/Totals/AmountInWords"/>
+                      <w:tag w:val="#Nav: InvoiceTemplate/50104"/>
+                    </w:sdtPr>
+                    <w:sdtContent>
+                      <w:proofErr w:type="spellStart"/>
+                      <w:r>
+                        <w:t>AmountInWords</w:t>
+                      </w:r>
+                      <w:proofErr w:type="spellEnd"/>
+                    </w:sdtContent>
+                  </w:sdt>
                 </w:p>
               </w:tc>
             </w:tr>
@@ -1458,7 +1525,7 @@
               </w:trPr>
               <w:tc>
                 <w:tcPr>
-                  <w:tcW w:w="11115" w:type="dxa"/>
+                  <w:tcW w:w="11194" w:type="dxa"/>
                   <w:gridSpan w:val="7"/>
                   <w:tcBorders>
                     <w:left w:val="nil"/>
@@ -1508,7 +1575,7 @@
               </w:tc>
               <w:tc>
                 <w:tcPr>
-                  <w:tcW w:w="6300" w:type="dxa"/>
+                  <w:tcW w:w="6379" w:type="dxa"/>
                   <w:gridSpan w:val="4"/>
                 </w:tcPr>
                 <w:p>
@@ -1581,7 +1648,7 @@
                       <w:tag w:val="#Nav: InvoiceTemplate/50104"/>
                       <w:id w:val="118803307"/>
                       <w:placeholder>
-                        <w:docPart w:val="A93D552B03EE4B85AE04700B4509FAD0"/>
+                        <w:docPart w:val="E5D4A8E36AD54BC8B92114D8949603C5"/>
                       </w:placeholder>
                       <w:dataBinding w:prefixMappings="xmlns:ns0='urn:microsoft-dynamics-nav/reports/InvoiceTemplate/50104/'" w:xpath="/ns0:NavWordReportXmlPart[1]/ns0:SalesHeader[1]/ns0:CompanyName[1]" w:storeItemID="{8BA33C80-C320-484C-9EE6-B028EA57E99B}"/>
                       <w:text/>
@@ -1603,7 +1670,7 @@
               </w:tc>
               <w:tc>
                 <w:tcPr>
-                  <w:tcW w:w="6300" w:type="dxa"/>
+                  <w:tcW w:w="6379" w:type="dxa"/>
                   <w:gridSpan w:val="4"/>
                   <w:tcBorders>
                     <w:bottom w:val="nil"/>
@@ -1636,7 +1703,7 @@
                       <w:tag w:val="#Nav: InvoiceTemplate/50104"/>
                       <w:id w:val="-312878675"/>
                       <w:placeholder>
-                        <w:docPart w:val="C2BDB527C8E949F98FC80043B13D2D92"/>
+                        <w:docPart w:val="CA6389120CB44DEE901BCFE487589570"/>
                       </w:placeholder>
                       <w:dataBinding w:prefixMappings="xmlns:ns0='urn:microsoft-dynamics-nav/reports/InvoiceTemplate/50104/'" w:xpath="/ns0:NavWordReportXmlPart[1]/ns0:SalesHeader[1]/ns0:BankAccountName[1]" w:storeItemID="{8BA33C80-C320-484C-9EE6-B028EA57E99B}"/>
                       <w:text/>
@@ -1690,7 +1757,7 @@
               </w:tc>
               <w:tc>
                 <w:tcPr>
-                  <w:tcW w:w="6300" w:type="dxa"/>
+                  <w:tcW w:w="6379" w:type="dxa"/>
                   <w:gridSpan w:val="4"/>
                   <w:tcBorders>
                     <w:top w:val="nil"/>
@@ -1732,7 +1799,7 @@
                       <w:tag w:val="#Nav: InvoiceTemplate/50104"/>
                       <w:id w:val="-861514494"/>
                       <w:placeholder>
-                        <w:docPart w:val="C2BDB527C8E949F98FC80043B13D2D92"/>
+                        <w:docPart w:val="CA6389120CB44DEE901BCFE487589570"/>
                       </w:placeholder>
                       <w:dataBinding w:prefixMappings="xmlns:ns0='urn:microsoft-dynamics-nav/reports/InvoiceTemplate/50104/'" w:xpath="/ns0:NavWordReportXmlPart[1]/ns0:SalesHeader[1]/ns0:BankAccountNo[1]" w:storeItemID="{8BA33C80-C320-484C-9EE6-B028EA57E99B}"/>
                       <w:text/>
@@ -1780,7 +1847,7 @@
               </w:tc>
               <w:tc>
                 <w:tcPr>
-                  <w:tcW w:w="6300" w:type="dxa"/>
+                  <w:tcW w:w="6379" w:type="dxa"/>
                   <w:gridSpan w:val="4"/>
                   <w:tcBorders>
                     <w:top w:val="nil"/>
@@ -1822,7 +1889,7 @@
                       <w:tag w:val="#Nav: InvoiceTemplate/50104"/>
                       <w:id w:val="424693989"/>
                       <w:placeholder>
-                        <w:docPart w:val="C2BDB527C8E949F98FC80043B13D2D92"/>
+                        <w:docPart w:val="CA6389120CB44DEE901BCFE487589570"/>
                       </w:placeholder>
                       <w:dataBinding w:prefixMappings="xmlns:ns0='urn:microsoft-dynamics-nav/reports/InvoiceTemplate/50104/'" w:xpath="/ns0:NavWordReportXmlPart[1]/ns0:SalesHeader[1]/ns0:BankIBAN[1]" w:storeItemID="{8BA33C80-C320-484C-9EE6-B028EA57E99B}"/>
                       <w:text/>
@@ -1870,7 +1937,7 @@
               </w:tc>
               <w:tc>
                 <w:tcPr>
-                  <w:tcW w:w="6300" w:type="dxa"/>
+                  <w:tcW w:w="6379" w:type="dxa"/>
                   <w:gridSpan w:val="4"/>
                   <w:tcBorders>
                     <w:top w:val="nil"/>
@@ -1912,7 +1979,7 @@
                       <w:tag w:val="#Nav: InvoiceTemplate/50104"/>
                       <w:id w:val="-1914460597"/>
                       <w:placeholder>
-                        <w:docPart w:val="C2BDB527C8E949F98FC80043B13D2D92"/>
+                        <w:docPart w:val="CA6389120CB44DEE901BCFE487589570"/>
                       </w:placeholder>
                       <w:dataBinding w:prefixMappings="xmlns:ns0='urn:microsoft-dynamics-nav/reports/InvoiceTemplate/50104/'" w:xpath="/ns0:NavWordReportXmlPart[1]/ns0:SalesHeader[1]/ns0:BankSwiftCode[1]" w:storeItemID="{8BA33C80-C320-484C-9EE6-B028EA57E99B}"/>
                       <w:text/>
@@ -1959,7 +2026,7 @@
               </w:tc>
               <w:tc>
                 <w:tcPr>
-                  <w:tcW w:w="6300" w:type="dxa"/>
+                  <w:tcW w:w="6379" w:type="dxa"/>
                   <w:gridSpan w:val="4"/>
                   <w:tcBorders>
                     <w:top w:val="nil"/>
@@ -2000,7 +2067,7 @@
                       <w:tag w:val="#Nav: InvoiceTemplate/50104"/>
                       <w:id w:val="1901783517"/>
                       <w:placeholder>
-                        <w:docPart w:val="C2BDB527C8E949F98FC80043B13D2D92"/>
+                        <w:docPart w:val="CA6389120CB44DEE901BCFE487589570"/>
                       </w:placeholder>
                       <w:dataBinding w:prefixMappings="xmlns:ns0='urn:microsoft-dynamics-nav/reports/InvoiceTemplate/50104/'" w:xpath="/ns0:NavWordReportXmlPart[1]/ns0:SalesHeader[1]/ns0:BankBranch[1]" w:storeItemID="{8BA33C80-C320-484C-9EE6-B028EA57E99B}"/>
                       <w:text/>
@@ -2568,7 +2635,7 @@
   <w:docParts>
     <w:docPart>
       <w:docPartPr>
-        <w:name w:val="C2BDB527C8E949F98FC80043B13D2D92"/>
+        <w:name w:val="CA6389120CB44DEE901BCFE487589570"/>
         <w:category>
           <w:name w:val="General"/>
           <w:gallery w:val="placeholder"/>
@@ -2579,12 +2646,12 @@
         <w:behaviors>
           <w:behavior w:val="content"/>
         </w:behaviors>
-        <w:guid w:val="{201910D0-47EE-4DEB-A1A3-C9FC97CC48CA}"/>
+        <w:guid w:val="{6078110D-92B9-4FD5-91C5-BFFCD20A4B56}"/>
       </w:docPartPr>
       <w:docPartBody>
         <w:p>
           <w:pPr>
-            <w:pStyle w:val="C2BDB527C8E949F98FC80043B13D2D92"/>
+            <w:pStyle w:val="CA6389120CB44DEE901BCFE487589570"/>
           </w:pPr>
           <w:r>
             <w:rPr>
@@ -2597,7 +2664,7 @@
     </w:docPart>
     <w:docPart>
       <w:docPartPr>
-        <w:name w:val="C8226EF33CE0421893D6D82A3D493C28"/>
+        <w:name w:val="5E1389E8ADA3429FA16E0508CAC6326D"/>
         <w:category>
           <w:name w:val="General"/>
           <w:gallery w:val="placeholder"/>
@@ -2608,12 +2675,12 @@
         <w:behaviors>
           <w:behavior w:val="content"/>
         </w:behaviors>
-        <w:guid w:val="{0079A789-2085-42BF-8480-363C6081AA5C}"/>
+        <w:guid w:val="{547DA8C6-6C04-47F0-94B8-446D232C8DD8}"/>
       </w:docPartPr>
       <w:docPartBody>
         <w:p>
           <w:pPr>
-            <w:pStyle w:val="C8226EF33CE0421893D6D82A3D493C28"/>
+            <w:pStyle w:val="5E1389E8ADA3429FA16E0508CAC6326D"/>
           </w:pPr>
           <w:r>
             <w:rPr>
@@ -2626,7 +2693,7 @@
     </w:docPart>
     <w:docPart>
       <w:docPartPr>
-        <w:name w:val="57C2D6F4C5AE428EA0DFE920DF61FA35"/>
+        <w:name w:val="60169553AAE34F98A47E6F59645076B7"/>
         <w:category>
           <w:name w:val="General"/>
           <w:gallery w:val="placeholder"/>
@@ -2637,12 +2704,12 @@
         <w:behaviors>
           <w:behavior w:val="content"/>
         </w:behaviors>
-        <w:guid w:val="{EC44DA0B-96E9-4C9C-BD8B-A4E27A28E2CA}"/>
+        <w:guid w:val="{0AF49BD6-9396-4638-8148-7EF7FA8944AC}"/>
       </w:docPartPr>
       <w:docPartBody>
         <w:p>
           <w:pPr>
-            <w:pStyle w:val="57C2D6F4C5AE428EA0DFE920DF61FA35"/>
+            <w:pStyle w:val="60169553AAE34F98A47E6F59645076B7"/>
           </w:pPr>
           <w:r>
             <w:rPr>
@@ -2655,7 +2722,7 @@
     </w:docPart>
     <w:docPart>
       <w:docPartPr>
-        <w:name w:val="551E7278097D490895F6E2D72FCD3727"/>
+        <w:name w:val="E2EC4E3FB0114F2A87D748090CBA06A0"/>
         <w:category>
           <w:name w:val="General"/>
           <w:gallery w:val="placeholder"/>
@@ -2666,12 +2733,12 @@
         <w:behaviors>
           <w:behavior w:val="content"/>
         </w:behaviors>
-        <w:guid w:val="{18FD3422-8DF2-4C86-8233-88D8FDEB4BEB}"/>
+        <w:guid w:val="{D5DC4A2F-D314-46F2-B0BE-B7A3342EF123}"/>
       </w:docPartPr>
       <w:docPartBody>
         <w:p>
           <w:pPr>
-            <w:pStyle w:val="551E7278097D490895F6E2D72FCD3727"/>
+            <w:pStyle w:val="E2EC4E3FB0114F2A87D748090CBA06A0"/>
           </w:pPr>
           <w:r>
             <w:rPr>
@@ -2684,7 +2751,7 @@
     </w:docPart>
     <w:docPart>
       <w:docPartPr>
-        <w:name w:val="16A3537A7C2846D1A278A0043FB728C7"/>
+        <w:name w:val="1C725278194D40A28F1C7D034414B69B"/>
         <w:category>
           <w:name w:val="General"/>
           <w:gallery w:val="placeholder"/>
@@ -2695,12 +2762,12 @@
         <w:behaviors>
           <w:behavior w:val="content"/>
         </w:behaviors>
-        <w:guid w:val="{04EF9E80-3B01-4ECE-AE44-1C9E0ADC5A07}"/>
+        <w:guid w:val="{B8A26CFB-2B22-4E74-947D-744CBA3CF181}"/>
       </w:docPartPr>
       <w:docPartBody>
         <w:p>
           <w:pPr>
-            <w:pStyle w:val="16A3537A7C2846D1A278A0043FB728C7"/>
+            <w:pStyle w:val="1C725278194D40A28F1C7D034414B69B"/>
           </w:pPr>
           <w:r>
             <w:rPr>
@@ -2713,7 +2780,7 @@
     </w:docPart>
     <w:docPart>
       <w:docPartPr>
-        <w:name w:val="B9D69747DC2A45A5812E8E7CBBD2B152"/>
+        <w:name w:val="A8DB9F97F4844D4BA1F43501635BFAB4"/>
         <w:category>
           <w:name w:val="General"/>
           <w:gallery w:val="placeholder"/>
@@ -2724,12 +2791,12 @@
         <w:behaviors>
           <w:behavior w:val="content"/>
         </w:behaviors>
-        <w:guid w:val="{60677B92-3025-4B19-BB58-948D0F081250}"/>
+        <w:guid w:val="{734EF093-4280-4A81-955C-98B9917EA124}"/>
       </w:docPartPr>
       <w:docPartBody>
         <w:p>
           <w:pPr>
-            <w:pStyle w:val="B9D69747DC2A45A5812E8E7CBBD2B152"/>
+            <w:pStyle w:val="A8DB9F97F4844D4BA1F43501635BFAB4"/>
           </w:pPr>
           <w:r>
             <w:rPr>
@@ -2742,7 +2809,7 @@
     </w:docPart>
     <w:docPart>
       <w:docPartPr>
-        <w:name w:val="32B1CDCF6FDB4F27A7906890AA1EFF94"/>
+        <w:name w:val="FA39F9D4505C400998C46A4D14FBE3DD"/>
         <w:category>
           <w:name w:val="General"/>
           <w:gallery w:val="placeholder"/>
@@ -2753,12 +2820,12 @@
         <w:behaviors>
           <w:behavior w:val="content"/>
         </w:behaviors>
-        <w:guid w:val="{F716F85C-65AF-4040-B593-DB2CB478EFBF}"/>
+        <w:guid w:val="{2052E6BD-DF8A-4933-A4FE-263E5D702D22}"/>
       </w:docPartPr>
       <w:docPartBody>
         <w:p>
           <w:pPr>
-            <w:pStyle w:val="32B1CDCF6FDB4F27A7906890AA1EFF94"/>
+            <w:pStyle w:val="FA39F9D4505C400998C46A4D14FBE3DD"/>
           </w:pPr>
           <w:r>
             <w:rPr>
@@ -2771,7 +2838,7 @@
     </w:docPart>
     <w:docPart>
       <w:docPartPr>
-        <w:name w:val="D5DA0457797248D5A4C046B1B1E8F750"/>
+        <w:name w:val="F5CE5E398A3F420B906A2C1DE1949DC7"/>
         <w:category>
           <w:name w:val="General"/>
           <w:gallery w:val="placeholder"/>
@@ -2782,12 +2849,12 @@
         <w:behaviors>
           <w:behavior w:val="content"/>
         </w:behaviors>
-        <w:guid w:val="{D8573604-300C-4C2F-B8A7-83D52336FC3F}"/>
+        <w:guid w:val="{60DD5BB0-3DE4-4A6A-B231-6563C17BCDFE}"/>
       </w:docPartPr>
       <w:docPartBody>
         <w:p>
           <w:pPr>
-            <w:pStyle w:val="D5DA0457797248D5A4C046B1B1E8F750"/>
+            <w:pStyle w:val="F5CE5E398A3F420B906A2C1DE1949DC7"/>
           </w:pPr>
           <w:r>
             <w:rPr>
@@ -2800,7 +2867,7 @@
     </w:docPart>
     <w:docPart>
       <w:docPartPr>
-        <w:name w:val="CE87644AA2F24C7F9C0835480F79C23D"/>
+        <w:name w:val="6C7ABCEF01C5406CA0CEC59563BEE7AA"/>
         <w:category>
           <w:name w:val="General"/>
           <w:gallery w:val="placeholder"/>
@@ -2811,12 +2878,41 @@
         <w:behaviors>
           <w:behavior w:val="content"/>
         </w:behaviors>
-        <w:guid w:val="{056FB366-768E-4A3D-BAC7-50F6505430EA}"/>
+        <w:guid w:val="{CF5F7E19-E492-497B-9768-ACC8B405E3F1}"/>
       </w:docPartPr>
       <w:docPartBody>
         <w:p>
           <w:pPr>
-            <w:pStyle w:val="CE87644AA2F24C7F9C0835480F79C23D"/>
+            <w:pStyle w:val="6C7ABCEF01C5406CA0CEC59563BEE7AA"/>
+          </w:pPr>
+          <w:r>
+            <w:rPr>
+              <w:rStyle w:val="PlaceholderText"/>
+            </w:rPr>
+            <w:t>Click or tap here to enter text.</w:t>
+          </w:r>
+        </w:p>
+      </w:docPartBody>
+    </w:docPart>
+    <w:docPart>
+      <w:docPartPr>
+        <w:name w:val="F005E960139B49DDA97AEA8072800EEB"/>
+        <w:category>
+          <w:name w:val="General"/>
+          <w:gallery w:val="placeholder"/>
+        </w:category>
+        <w:types>
+          <w:type w:val="bbPlcHdr"/>
+        </w:types>
+        <w:behaviors>
+          <w:behavior w:val="content"/>
+        </w:behaviors>
+        <w:guid w:val="{A5A9CE0D-8A87-4CA3-8BA9-BBD7871ED1C2}"/>
+      </w:docPartPr>
+      <w:docPartBody>
+        <w:p>
+          <w:pPr>
+            <w:pStyle w:val="F005E960139B49DDA97AEA8072800EEB"/>
           </w:pPr>
           <w:r>
             <w:rPr>
@@ -2829,7 +2925,7 @@
     </w:docPart>
     <w:docPart>
       <w:docPartPr>
-        <w:name w:val="A93D552B03EE4B85AE04700B4509FAD0"/>
+        <w:name w:val="E5D4A8E36AD54BC8B92114D8949603C5"/>
         <w:category>
           <w:name w:val="General"/>
           <w:gallery w:val="placeholder"/>
@@ -2840,12 +2936,12 @@
         <w:behaviors>
           <w:behavior w:val="content"/>
         </w:behaviors>
-        <w:guid w:val="{674C9A4F-AE04-4C07-8433-29EACC72691A}"/>
+        <w:guid w:val="{C928D48C-C4FD-405C-A16E-017C21389523}"/>
       </w:docPartPr>
       <w:docPartBody>
         <w:p>
           <w:pPr>
-            <w:pStyle w:val="A93D552B03EE4B85AE04700B4509FAD0"/>
+            <w:pStyle w:val="E5D4A8E36AD54BC8B92114D8949603C5"/>
           </w:pPr>
           <w:r>
             <w:rPr>
@@ -2869,7 +2965,7 @@
         <w:behaviors>
           <w:behavior w:val="content"/>
         </w:behaviors>
-        <w:guid w:val="{BAE2D098-30C8-4AC4-A3F6-B1CD8CC279A4}"/>
+        <w:guid w:val="{7B5D4AA9-A992-4CE5-8B2F-60548B47F185}"/>
       </w:docPartPr>
       <w:docPartBody>
         <w:p>
@@ -2938,12 +3034,17 @@
     <w:rsid w:val="000174E1"/>
     <w:rsid w:val="000F76D5"/>
     <w:rsid w:val="002F6C9F"/>
+    <w:rsid w:val="00465559"/>
     <w:rsid w:val="005C3E47"/>
     <w:rsid w:val="005D50CB"/>
+    <w:rsid w:val="009658F0"/>
     <w:rsid w:val="00973507"/>
+    <w:rsid w:val="00D977B6"/>
     <w:rsid w:val="00E5272E"/>
+    <w:rsid w:val="00F15C8A"/>
     <w:rsid w:val="00F36577"/>
     <w:rsid w:val="00F558E0"/>
+    <w:rsid w:val="00FE6CE9"/>
   </w:rsids>
   <m:mathPr>
     <m:mathFont m:val="Cambria Math"/>
@@ -3399,50 +3500,54 @@
     <w:basedOn w:val="DefaultParagraphFont"/>
     <w:uiPriority w:val="99"/>
     <w:semiHidden/>
-    <w:rsid w:val="000F76D5"/>
+    <w:rsid w:val="009658F0"/>
     <w:rPr>
       <w:color w:val="666666"/>
     </w:rPr>
   </w:style>
-  <w:style w:type="paragraph" w:customStyle="1" w:styleId="C2BDB527C8E949F98FC80043B13D2D92">
-    <w:name w:val="C2BDB527C8E949F98FC80043B13D2D92"/>
-    <w:rsid w:val="000174E1"/>
+  <w:style w:type="paragraph" w:customStyle="1" w:styleId="CA6389120CB44DEE901BCFE487589570">
+    <w:name w:val="CA6389120CB44DEE901BCFE487589570"/>
+    <w:rsid w:val="00F15C8A"/>
   </w:style>
-  <w:style w:type="paragraph" w:customStyle="1" w:styleId="C8226EF33CE0421893D6D82A3D493C28">
-    <w:name w:val="C8226EF33CE0421893D6D82A3D493C28"/>
-    <w:rsid w:val="000174E1"/>
+  <w:style w:type="paragraph" w:customStyle="1" w:styleId="5E1389E8ADA3429FA16E0508CAC6326D">
+    <w:name w:val="5E1389E8ADA3429FA16E0508CAC6326D"/>
+    <w:rsid w:val="00F15C8A"/>
   </w:style>
-  <w:style w:type="paragraph" w:customStyle="1" w:styleId="57C2D6F4C5AE428EA0DFE920DF61FA35">
-    <w:name w:val="57C2D6F4C5AE428EA0DFE920DF61FA35"/>
-    <w:rsid w:val="000174E1"/>
+  <w:style w:type="paragraph" w:customStyle="1" w:styleId="60169553AAE34F98A47E6F59645076B7">
+    <w:name w:val="60169553AAE34F98A47E6F59645076B7"/>
+    <w:rsid w:val="00F15C8A"/>
   </w:style>
-  <w:style w:type="paragraph" w:customStyle="1" w:styleId="551E7278097D490895F6E2D72FCD3727">
-    <w:name w:val="551E7278097D490895F6E2D72FCD3727"/>
-    <w:rsid w:val="000174E1"/>
+  <w:style w:type="paragraph" w:customStyle="1" w:styleId="E2EC4E3FB0114F2A87D748090CBA06A0">
+    <w:name w:val="E2EC4E3FB0114F2A87D748090CBA06A0"/>
+    <w:rsid w:val="00F15C8A"/>
   </w:style>
-  <w:style w:type="paragraph" w:customStyle="1" w:styleId="16A3537A7C2846D1A278A0043FB728C7">
-    <w:name w:val="16A3537A7C2846D1A278A0043FB728C7"/>
-    <w:rsid w:val="000174E1"/>
+  <w:style w:type="paragraph" w:customStyle="1" w:styleId="1C725278194D40A28F1C7D034414B69B">
+    <w:name w:val="1C725278194D40A28F1C7D034414B69B"/>
+    <w:rsid w:val="00F15C8A"/>
   </w:style>
-  <w:style w:type="paragraph" w:customStyle="1" w:styleId="B9D69747DC2A45A5812E8E7CBBD2B152">
-    <w:name w:val="B9D69747DC2A45A5812E8E7CBBD2B152"/>
-    <w:rsid w:val="000174E1"/>
+  <w:style w:type="paragraph" w:customStyle="1" w:styleId="A8DB9F97F4844D4BA1F43501635BFAB4">
+    <w:name w:val="A8DB9F97F4844D4BA1F43501635BFAB4"/>
+    <w:rsid w:val="00F15C8A"/>
   </w:style>
-  <w:style w:type="paragraph" w:customStyle="1" w:styleId="32B1CDCF6FDB4F27A7906890AA1EFF94">
-    <w:name w:val="32B1CDCF6FDB4F27A7906890AA1EFF94"/>
-    <w:rsid w:val="000174E1"/>
+  <w:style w:type="paragraph" w:customStyle="1" w:styleId="FA39F9D4505C400998C46A4D14FBE3DD">
+    <w:name w:val="FA39F9D4505C400998C46A4D14FBE3DD"/>
+    <w:rsid w:val="00F15C8A"/>
   </w:style>
-  <w:style w:type="paragraph" w:customStyle="1" w:styleId="D5DA0457797248D5A4C046B1B1E8F750">
-    <w:name w:val="D5DA0457797248D5A4C046B1B1E8F750"/>
-    <w:rsid w:val="000174E1"/>
+  <w:style w:type="paragraph" w:customStyle="1" w:styleId="F5CE5E398A3F420B906A2C1DE1949DC7">
+    <w:name w:val="F5CE5E398A3F420B906A2C1DE1949DC7"/>
+    <w:rsid w:val="00F15C8A"/>
   </w:style>
-  <w:style w:type="paragraph" w:customStyle="1" w:styleId="CE87644AA2F24C7F9C0835480F79C23D">
-    <w:name w:val="CE87644AA2F24C7F9C0835480F79C23D"/>
-    <w:rsid w:val="000174E1"/>
+  <w:style w:type="paragraph" w:customStyle="1" w:styleId="6C7ABCEF01C5406CA0CEC59563BEE7AA">
+    <w:name w:val="6C7ABCEF01C5406CA0CEC59563BEE7AA"/>
+    <w:rsid w:val="00F15C8A"/>
   </w:style>
-  <w:style w:type="paragraph" w:customStyle="1" w:styleId="A93D552B03EE4B85AE04700B4509FAD0">
-    <w:name w:val="A93D552B03EE4B85AE04700B4509FAD0"/>
-    <w:rsid w:val="000174E1"/>
+  <w:style w:type="paragraph" w:customStyle="1" w:styleId="F005E960139B49DDA97AEA8072800EEB">
+    <w:name w:val="F005E960139B49DDA97AEA8072800EEB"/>
+    <w:rsid w:val="00F15C8A"/>
+  </w:style>
+  <w:style w:type="paragraph" w:customStyle="1" w:styleId="E5D4A8E36AD54BC8B92114D8949603C5">
+    <w:name w:val="E5D4A8E36AD54BC8B92114D8949603C5"/>
+    <w:rsid w:val="00F15C8A"/>
   </w:style>
 </w:styles>
 </file>
@@ -3749,7 +3854,9 @@
 </a:theme>
 </file>
 
-<file path=customXml/item1.xml>��< ? x m l   v e r s i o n = " 1 . 0 "   e n c o d i n g = " u t f - 1 6 " ? > < N a v W o r d R e p o r t X m l P a r t   x m l n s = " u r n : m i c r o s o f t - d y n a m i c s - n a v / r e p o r t s / I n v o i c e T e m p l a t e / 5 0 1 0 4 / " > +<file path=customXml/item1.xml>��< ? x m l   v e r s i o n = " 1 . 0 "   e n c o d i n g = " u t f - 1 6 " ? > + 
+ < N a v W o r d R e p o r t X m l P a r t   x m l n s = " u r n : m i c r o s o f t - d y n a m i c s - n a v / r e p o r t s / I n v o i c e T e m p l a t e / 5 0 1 0 4 / " >   
      < B C R e p o r t I n f o r m a t i o n >   
@@ -3841,7 +3948,7 @@
  
          < C o m p a n y P h o n e > C o m p a n y P h o n e < / C o m p a n y P h o n e >   
-         < C o m p a n y P i c t u r e > C o m p a n y P i c t u r e < / C o m p a n y P i c t u r e > +         < C o m p a n y P i c t u r e   / >   
          < C o m p a n y P o s t c o d e > C o m p a n y P o s t c o d e < / C o m p a n y P o s t c o d e >   
@@ -3891,6 +3998,8 @@
  
              < S a l e L i n e N o _ > S a l e L i n e N o _ < / S a l e L i n e N o _ >   
+             < S e r i a l _ N o > S e r i a l _ N o < / S e r i a l _ N o > + 
              < V A T _ B a s e _ A m o u n t > V A T _ B a s e _ A m o u n t < / V A T _ B a s e _ A m o u n t >   
              < V A T _ _ > V A T _ _ < / V A T _ _ > @@ -3898,6 +4007,8 @@
          < / S a l e s _ L i n e >   
          < T o t a l s > + 
+             < A m o u n t I n W o r d s > A m o u n t I n W o r d s < / A m o u n t I n W o r d s >   
              < T o t a l A m o u n t I n c l V A T > T o t a l A m o u n t I n c l V A T < / T o t a l A m o u n t I n c l V A T >   

</xml_diff>